<commit_message>
Fix Q18 May 2025: wrong answer + missing part a)
Two errors corrected:
- P(Income=High|LR) was 3/4, correct value is 2/4 (only ID4 and ID6
  are High income among the 4 Low Risk instances)
- Score(LR) was 0.1607 (wrong), correct is 0.0536 -> classification
  flips from LOW RISK to HIGH RISK
- Q18a (8 marks) was completely absent: added key assumption
  (conditional independence) + Naive Bayes DAG with Risk as parent
  and arrows pointing to Income, Credit History, Late Payment

Co-Authored-By: Claude Sonnet 4.6 <noreply@anthropic.com>
</commit_message>
<xml_diff>
--- a/COMP4431_Full_Exam_Notes.docx
+++ b/COMP4431_Full_Exam_Notes.docx
@@ -12283,7 +12283,408 @@
         <w:pStyle w:val="Heading4"/>
       </w:pPr>
       <w:r>
-        <w:t>May 2025 Q18 — Credit Risk: HR=3/7, LR=4/7. Classify: Income=High, Credit=Bad, Late=No</w:t>
+        <w:t>May 2025 Q18 — Full question has TWO parts</w:t>
+      </w:r>
+    </w:p>
+    <w:p>
+      <w:pPr>
+        <w:spacing w:after="40"/>
+      </w:pPr>
+      <w:r>
+        <w:rPr>
+          <w:b/>
+          <w:color w:val="2563EB"/>
+          <w:sz w:val="20"/>
+        </w:rPr>
+        <w:t>Key assumption + DAG diagram</w:t>
+      </w:r>
+      <w:r>
+        <w:rPr>
+          <w:color w:val="2563EB"/>
+          <w:sz w:val="20"/>
+        </w:rPr>
+        <w:t xml:space="preserve">Part a) [8 marks] — </w:t>
+      </w:r>
+    </w:p>
+    <w:p>
+      <w:pPr>
+        <w:spacing w:after="40"/>
+      </w:pPr>
+      <w:r>
+        <w:rPr>
+          <w:b/>
+          <w:color w:val="2563EB"/>
+          <w:sz w:val="20"/>
+        </w:rPr>
+        <w:t>Naive Bayes assumes CONDITIONAL INDEPENDENCE — given the class label (Risk), each feature (Income, Credit History, Late Payment) is independent of all other features.</w:t>
+      </w:r>
+      <w:r>
+        <w:rPr>
+          <w:color w:val="2563EB"/>
+          <w:sz w:val="20"/>
+        </w:rPr>
+        <w:t xml:space="preserve">Key assumption: </w:t>
+      </w:r>
+    </w:p>
+    <w:p>
+      <w:pPr>
+        <w:spacing w:after="40"/>
+        <w:ind w:left="320"/>
+      </w:pPr>
+      <w:r>
+        <w:rPr>
+          <w:rFonts w:ascii="Courier New" w:hAnsi="Courier New"/>
+          <w:color w:val="06B6D4"/>
+          <w:sz w:val="20"/>
+        </w:rPr>
+        <w:t>P(Income, Credit, Late | Risk) = P(Income|Risk) × P(Credit|Risk) × P(Late|Risk)</w:t>
+      </w:r>
+    </w:p>
+    <w:p>
+      <w:pPr>
+        <w:spacing w:after="40"/>
+      </w:pPr>
+      <w:r>
+        <w:rPr>
+          <w:b/>
+          <w:color w:val="2563EB"/>
+          <w:sz w:val="20"/>
+        </w:rPr>
+        <w:t>Risk is the single parent node. Arrows point FROM Risk TO each feature.</w:t>
+      </w:r>
+      <w:r>
+        <w:rPr>
+          <w:color w:val="2563EB"/>
+          <w:sz w:val="20"/>
+        </w:rPr>
+        <w:t xml:space="preserve">DAG diagram: </w:t>
+      </w:r>
+    </w:p>
+    <w:p>
+      <w:pPr>
+        <w:spacing w:after="40"/>
+        <w:ind w:left="320"/>
+      </w:pPr>
+      <w:r>
+        <w:rPr>
+          <w:rFonts w:ascii="Courier New" w:hAnsi="Courier New"/>
+          <w:color w:val="06B6D4"/>
+          <w:sz w:val="20"/>
+        </w:rPr>
+        <w:t xml:space="preserve">         Risk</w:t>
+      </w:r>
+    </w:p>
+    <w:p>
+      <w:pPr>
+        <w:spacing w:after="40"/>
+        <w:ind w:left="320"/>
+      </w:pPr>
+      <w:r>
+        <w:rPr>
+          <w:rFonts w:ascii="Courier New" w:hAnsi="Courier New"/>
+          <w:color w:val="06B6D4"/>
+          <w:sz w:val="20"/>
+        </w:rPr>
+        <w:t xml:space="preserve">        /  |  \</w:t>
+      </w:r>
+    </w:p>
+    <w:p>
+      <w:pPr>
+        <w:spacing w:after="40"/>
+        <w:ind w:left="320"/>
+      </w:pPr>
+      <w:r>
+        <w:rPr>
+          <w:rFonts w:ascii="Courier New" w:hAnsi="Courier New"/>
+          <w:color w:val="06B6D4"/>
+          <w:sz w:val="20"/>
+        </w:rPr>
+        <w:t xml:space="preserve">       ↓   ↓   ↓</w:t>
+      </w:r>
+    </w:p>
+    <w:p>
+      <w:pPr>
+        <w:spacing w:after="40"/>
+        <w:ind w:left="320"/>
+      </w:pPr>
+      <w:r>
+        <w:rPr>
+          <w:rFonts w:ascii="Courier New" w:hAnsi="Courier New"/>
+          <w:color w:val="06B6D4"/>
+          <w:sz w:val="20"/>
+        </w:rPr>
+        <w:t xml:space="preserve">  Income Credit Late</w:t>
+      </w:r>
+    </w:p>
+    <w:p>
+      <w:pPr>
+        <w:spacing w:after="40"/>
+        <w:ind w:left="320"/>
+      </w:pPr>
+      <w:r>
+        <w:rPr>
+          <w:rFonts w:ascii="Courier New" w:hAnsi="Courier New"/>
+          <w:color w:val="06B6D4"/>
+          <w:sz w:val="20"/>
+        </w:rPr>
+        <w:t xml:space="preserve">        History Payment</w:t>
+      </w:r>
+    </w:p>
+    <w:p>
+      <w:pPr>
+        <w:spacing w:after="40"/>
+      </w:pPr>
+      <w:r>
+        <w:rPr>
+          <w:b/>
+          <w:color w:val="F59E0B"/>
+          <w:sz w:val="20"/>
+        </w:rPr>
+        <w:t xml:space="preserve">NOTE: </w:t>
+      </w:r>
+      <w:r>
+        <w:rPr>
+          <w:color w:val="92400E"/>
+          <w:sz w:val="20"/>
+        </w:rPr>
+        <w:t>Exam tip: In the Naive Bayes DAG, the CLASS is always the parent. All features are children with arrows pointing FROM class TO features. This is opposite to a causal model.</w:t>
+      </w:r>
+    </w:p>
+    <w:p>
+      <w:pPr>
+        <w:spacing w:after="0"/>
+      </w:pPr>
+    </w:p>
+    <w:p>
+      <w:pPr>
+        <w:spacing w:after="40"/>
+      </w:pPr>
+      <w:r>
+        <w:rPr>
+          <w:b/>
+          <w:color w:val="2563EB"/>
+          <w:sz w:val="20"/>
+        </w:rPr>
+        <w:t>Full classification calculation</w:t>
+      </w:r>
+      <w:r>
+        <w:rPr>
+          <w:color w:val="2563EB"/>
+          <w:sz w:val="20"/>
+        </w:rPr>
+        <w:t xml:space="preserve">Part b) [12 marks] — </w:t>
+      </w:r>
+    </w:p>
+    <w:p>
+      <w:pPr>
+        <w:spacing w:after="40"/>
+      </w:pPr>
+      <w:r>
+        <w:rPr>
+          <w:color w:val="2563EB"/>
+          <w:sz w:val="20"/>
+        </w:rPr>
+        <w:t>Step 1 — Count training data:</w:t>
+      </w:r>
+    </w:p>
+    <w:tbl>
+      <w:tblPr>
+        <w:tblStyle w:val="TableGrid"/>
+        <w:tblW w:type="auto" w:w="0"/>
+        <w:tblLook w:firstColumn="1" w:firstRow="1" w:lastColumn="0" w:lastRow="0" w:noHBand="0" w:noVBand="1" w:val="04A0"/>
+      </w:tblPr>
+      <w:tblGrid>
+        <w:gridCol w:w="2493"/>
+        <w:gridCol w:w="2493"/>
+        <w:gridCol w:w="2493"/>
+        <w:gridCol w:w="2493"/>
+      </w:tblGrid>
+      <w:tr>
+        <w:tc>
+          <w:tcPr>
+            <w:tcW w:type="dxa" w:w="1872"/>
+            <w:shd w:fill="D6E4F0" w:val="clear"/>
+          </w:tcPr>
+          <w:p>
+            <w:r>
+              <w:rPr>
+                <w:b/>
+                <w:sz w:val="18"/>
+              </w:rPr>
+              <w:t>Class</w:t>
+            </w:r>
+          </w:p>
+        </w:tc>
+        <w:tc>
+          <w:tcPr>
+            <w:tcW w:type="dxa" w:w="864"/>
+            <w:shd w:fill="D6E4F0" w:val="clear"/>
+          </w:tcPr>
+          <w:p>
+            <w:r>
+              <w:rPr>
+                <w:b/>
+                <w:sz w:val="18"/>
+              </w:rPr>
+              <w:t>Count</w:t>
+            </w:r>
+          </w:p>
+        </w:tc>
+        <w:tc>
+          <w:tcPr>
+            <w:tcW w:type="dxa" w:w="4896"/>
+            <w:shd w:fill="D6E4F0" w:val="clear"/>
+          </w:tcPr>
+          <w:p>
+            <w:r>
+              <w:rPr>
+                <w:b/>
+                <w:sz w:val="18"/>
+              </w:rPr>
+              <w:t>IDs</w:t>
+            </w:r>
+          </w:p>
+        </w:tc>
+        <w:tc>
+          <w:tcPr>
+            <w:tcW w:type="dxa" w:w="1584"/>
+            <w:shd w:fill="D6E4F0" w:val="clear"/>
+          </w:tcPr>
+          <w:p>
+            <w:r>
+              <w:rPr>
+                <w:b/>
+                <w:sz w:val="18"/>
+              </w:rPr>
+              <w:t>Prior</w:t>
+            </w:r>
+          </w:p>
+        </w:tc>
+      </w:tr>
+      <w:tr>
+        <w:tc>
+          <w:tcPr>
+            <w:tcW w:type="dxa" w:w="1872"/>
+          </w:tcPr>
+          <w:p>
+            <w:r>
+              <w:rPr>
+                <w:sz w:val="18"/>
+              </w:rPr>
+              <w:t>High Risk (HR)</w:t>
+            </w:r>
+          </w:p>
+        </w:tc>
+        <w:tc>
+          <w:tcPr>
+            <w:tcW w:type="dxa" w:w="864"/>
+          </w:tcPr>
+          <w:p>
+            <w:r>
+              <w:rPr>
+                <w:sz w:val="18"/>
+              </w:rPr>
+              <w:t>3</w:t>
+            </w:r>
+          </w:p>
+        </w:tc>
+        <w:tc>
+          <w:tcPr>
+            <w:tcW w:type="dxa" w:w="4896"/>
+          </w:tcPr>
+          <w:p>
+            <w:r>
+              <w:rPr>
+                <w:sz w:val="18"/>
+              </w:rPr>
+              <w:t>1 (Low,Bad,Yes), 3 (High,Bad,Yes), 7 (High,Good,No)</w:t>
+            </w:r>
+          </w:p>
+        </w:tc>
+        <w:tc>
+          <w:tcPr>
+            <w:tcW w:type="dxa" w:w="1584"/>
+          </w:tcPr>
+          <w:p>
+            <w:r>
+              <w:rPr>
+                <w:sz w:val="18"/>
+              </w:rPr>
+              <w:t>P(HR) = 3/7</w:t>
+            </w:r>
+          </w:p>
+        </w:tc>
+      </w:tr>
+      <w:tr>
+        <w:tc>
+          <w:tcPr>
+            <w:tcW w:type="dxa" w:w="1872"/>
+          </w:tcPr>
+          <w:p>
+            <w:r>
+              <w:rPr>
+                <w:sz w:val="18"/>
+              </w:rPr>
+              <w:t>Low Risk (LR)</w:t>
+            </w:r>
+          </w:p>
+        </w:tc>
+        <w:tc>
+          <w:tcPr>
+            <w:tcW w:type="dxa" w:w="864"/>
+          </w:tcPr>
+          <w:p>
+            <w:r>
+              <w:rPr>
+                <w:sz w:val="18"/>
+              </w:rPr>
+              <w:t>4</w:t>
+            </w:r>
+          </w:p>
+        </w:tc>
+        <w:tc>
+          <w:tcPr>
+            <w:tcW w:type="dxa" w:w="4896"/>
+          </w:tcPr>
+          <w:p>
+            <w:r>
+              <w:rPr>
+                <w:sz w:val="18"/>
+              </w:rPr>
+              <w:t>2 (Low,Bad,No), 4 (High,Good,No), 5 (Low,Good,No), 6 (High,Good,Yes)</w:t>
+            </w:r>
+          </w:p>
+        </w:tc>
+        <w:tc>
+          <w:tcPr>
+            <w:tcW w:type="dxa" w:w="1584"/>
+          </w:tcPr>
+          <w:p>
+            <w:r>
+              <w:rPr>
+                <w:sz w:val="18"/>
+              </w:rPr>
+              <w:t>P(LR) = 4/7</w:t>
+            </w:r>
+          </w:p>
+        </w:tc>
+      </w:tr>
+    </w:tbl>
+    <w:p>
+      <w:pPr>
+        <w:spacing w:after="0"/>
+      </w:pPr>
+    </w:p>
+    <w:p>
+      <w:pPr>
+        <w:spacing w:after="40"/>
+      </w:pPr>
+      <w:r>
+        <w:rPr>
+          <w:color w:val="2563EB"/>
+          <w:sz w:val="20"/>
+        </w:rPr>
+        <w:t>Step 2 — Conditional probability tables:</w:t>
       </w:r>
     </w:p>
     <w:tbl>
@@ -12303,7 +12704,7 @@
       <w:tr>
         <w:tc>
           <w:tcPr>
-            <w:tcW w:type="dxa" w:w="1440"/>
+            <w:tcW w:type="dxa" w:w="1872"/>
             <w:shd w:fill="D6E4F0" w:val="clear"/>
           </w:tcPr>
           <w:p>
@@ -12312,7 +12713,7 @@
                 <w:b/>
                 <w:sz w:val="18"/>
               </w:rPr>
-              <w:t>Class</w:t>
+              <w:t>Feature</w:t>
             </w:r>
           </w:p>
         </w:tc>
@@ -12327,7 +12728,7 @@
                 <w:b/>
                 <w:sz w:val="18"/>
               </w:rPr>
-              <w:t>P(class)</w:t>
+              <w:t>Value</w:t>
             </w:r>
           </w:p>
         </w:tc>
@@ -12342,7 +12743,22 @@
                 <w:b/>
                 <w:sz w:val="18"/>
               </w:rPr>
-              <w:t>P(Income=High|C)</w:t>
+              <w:t>HR count (of 3)</w:t>
+            </w:r>
+          </w:p>
+        </w:tc>
+        <w:tc>
+          <w:tcPr>
+            <w:tcW w:type="dxa" w:w="1296"/>
+            <w:shd w:fill="D6E4F0" w:val="clear"/>
+          </w:tcPr>
+          <w:p>
+            <w:r>
+              <w:rPr>
+                <w:b/>
+                <w:sz w:val="18"/>
+              </w:rPr>
+              <w:t>P(val|HR)</w:t>
             </w:r>
           </w:p>
         </w:tc>
@@ -12357,13 +12773,13 @@
                 <w:b/>
                 <w:sz w:val="18"/>
               </w:rPr>
-              <w:t>P(Credit=Bad|C)</w:t>
-            </w:r>
-          </w:p>
-        </w:tc>
-        <w:tc>
-          <w:tcPr>
-            <w:tcW w:type="dxa" w:w="1872"/>
+              <w:t>LR count (of 4)</w:t>
+            </w:r>
+          </w:p>
+        </w:tc>
+        <w:tc>
+          <w:tcPr>
+            <w:tcW w:type="dxa" w:w="1296"/>
             <w:shd w:fill="D6E4F0" w:val="clear"/>
           </w:tcPr>
           <w:p>
@@ -12372,22 +12788,7 @@
                 <w:b/>
                 <w:sz w:val="18"/>
               </w:rPr>
-              <w:t>P(Late=No|C)</w:t>
-            </w:r>
-          </w:p>
-        </w:tc>
-        <w:tc>
-          <w:tcPr>
-            <w:tcW w:type="dxa" w:w="2304"/>
-            <w:shd w:fill="D6E4F0" w:val="clear"/>
-          </w:tcPr>
-          <w:p>
-            <w:r>
-              <w:rPr>
-                <w:b/>
-                <w:sz w:val="18"/>
-              </w:rPr>
-              <w:t>Score</w:t>
+              <w:t>P(val|LR)</w:t>
             </w:r>
           </w:p>
         </w:tc>
@@ -12395,14 +12796,14 @@
       <w:tr>
         <w:tc>
           <w:tcPr>
-            <w:tcW w:type="dxa" w:w="1440"/>
-          </w:tcPr>
-          <w:p>
-            <w:r>
-              <w:rPr>
-                <w:sz w:val="18"/>
-              </w:rPr>
-              <w:t>High Risk (HR)</w:t>
+            <w:tcW w:type="dxa" w:w="1872"/>
+          </w:tcPr>
+          <w:p>
+            <w:r>
+              <w:rPr>
+                <w:sz w:val="18"/>
+              </w:rPr>
+              <w:t>Income</w:t>
             </w:r>
           </w:p>
         </w:tc>
@@ -12415,7 +12816,7 @@
               <w:rPr>
                 <w:sz w:val="18"/>
               </w:rPr>
-              <w:t>3/7</w:t>
+              <w:t>High</w:t>
             </w:r>
           </w:p>
         </w:tc>
@@ -12428,6 +12829,19 @@
               <w:rPr>
                 <w:sz w:val="18"/>
               </w:rPr>
+              <w:t>ID3,ID7 = 2</w:t>
+            </w:r>
+          </w:p>
+        </w:tc>
+        <w:tc>
+          <w:tcPr>
+            <w:tcW w:type="dxa" w:w="1296"/>
+          </w:tcPr>
+          <w:p>
+            <w:r>
+              <w:rPr>
+                <w:sz w:val="18"/>
+              </w:rPr>
               <w:t>2/3</w:t>
             </w:r>
           </w:p>
@@ -12441,33 +12855,20 @@
               <w:rPr>
                 <w:sz w:val="18"/>
               </w:rPr>
-              <w:t>2/3</w:t>
-            </w:r>
-          </w:p>
-        </w:tc>
-        <w:tc>
-          <w:tcPr>
-            <w:tcW w:type="dxa" w:w="1872"/>
-          </w:tcPr>
-          <w:p>
-            <w:r>
-              <w:rPr>
-                <w:sz w:val="18"/>
-              </w:rPr>
-              <w:t>1/3</w:t>
-            </w:r>
-          </w:p>
-        </w:tc>
-        <w:tc>
-          <w:tcPr>
-            <w:tcW w:type="dxa" w:w="2304"/>
-          </w:tcPr>
-          <w:p>
-            <w:r>
-              <w:rPr>
-                <w:sz w:val="18"/>
-              </w:rPr>
-              <w:t>3/7*2/3*2/3*1/3 = 0.0635</w:t>
+              <w:t>ID4,ID6 = 2</w:t>
+            </w:r>
+          </w:p>
+        </w:tc>
+        <w:tc>
+          <w:tcPr>
+            <w:tcW w:type="dxa" w:w="1296"/>
+          </w:tcPr>
+          <w:p>
+            <w:r>
+              <w:rPr>
+                <w:sz w:val="18"/>
+              </w:rPr>
+              <w:t>2/4</w:t>
             </w:r>
           </w:p>
         </w:tc>
@@ -12475,14 +12876,14 @@
       <w:tr>
         <w:tc>
           <w:tcPr>
-            <w:tcW w:type="dxa" w:w="1440"/>
-          </w:tcPr>
-          <w:p>
-            <w:r>
-              <w:rPr>
-                <w:sz w:val="18"/>
-              </w:rPr>
-              <w:t>Low Risk (LR)</w:t>
+            <w:tcW w:type="dxa" w:w="1872"/>
+          </w:tcPr>
+          <w:p>
+            <w:r>
+              <w:rPr>
+                <w:sz w:val="18"/>
+              </w:rPr>
+              <w:t>Credit History</w:t>
             </w:r>
           </w:p>
         </w:tc>
@@ -12495,7 +12896,7 @@
               <w:rPr>
                 <w:sz w:val="18"/>
               </w:rPr>
-              <w:t>4/7</w:t>
+              <w:t>Bad</w:t>
             </w:r>
           </w:p>
         </w:tc>
@@ -12508,46 +12909,126 @@
               <w:rPr>
                 <w:sz w:val="18"/>
               </w:rPr>
+              <w:t>ID1,ID3 = 2</w:t>
+            </w:r>
+          </w:p>
+        </w:tc>
+        <w:tc>
+          <w:tcPr>
+            <w:tcW w:type="dxa" w:w="1296"/>
+          </w:tcPr>
+          <w:p>
+            <w:r>
+              <w:rPr>
+                <w:sz w:val="18"/>
+              </w:rPr>
+              <w:t>2/3</w:t>
+            </w:r>
+          </w:p>
+        </w:tc>
+        <w:tc>
+          <w:tcPr>
+            <w:tcW w:type="dxa" w:w="2160"/>
+          </w:tcPr>
+          <w:p>
+            <w:r>
+              <w:rPr>
+                <w:sz w:val="18"/>
+              </w:rPr>
+              <w:t>ID2 = 1</w:t>
+            </w:r>
+          </w:p>
+        </w:tc>
+        <w:tc>
+          <w:tcPr>
+            <w:tcW w:type="dxa" w:w="1296"/>
+          </w:tcPr>
+          <w:p>
+            <w:r>
+              <w:rPr>
+                <w:sz w:val="18"/>
+              </w:rPr>
+              <w:t>1/4</w:t>
+            </w:r>
+          </w:p>
+        </w:tc>
+      </w:tr>
+      <w:tr>
+        <w:tc>
+          <w:tcPr>
+            <w:tcW w:type="dxa" w:w="1872"/>
+          </w:tcPr>
+          <w:p>
+            <w:r>
+              <w:rPr>
+                <w:sz w:val="18"/>
+              </w:rPr>
+              <w:t>Late Payment</w:t>
+            </w:r>
+          </w:p>
+        </w:tc>
+        <w:tc>
+          <w:tcPr>
+            <w:tcW w:type="dxa" w:w="1008"/>
+          </w:tcPr>
+          <w:p>
+            <w:r>
+              <w:rPr>
+                <w:sz w:val="18"/>
+              </w:rPr>
+              <w:t>No</w:t>
+            </w:r>
+          </w:p>
+        </w:tc>
+        <w:tc>
+          <w:tcPr>
+            <w:tcW w:type="dxa" w:w="2160"/>
+          </w:tcPr>
+          <w:p>
+            <w:r>
+              <w:rPr>
+                <w:sz w:val="18"/>
+              </w:rPr>
+              <w:t>ID7 = 1</w:t>
+            </w:r>
+          </w:p>
+        </w:tc>
+        <w:tc>
+          <w:tcPr>
+            <w:tcW w:type="dxa" w:w="1296"/>
+          </w:tcPr>
+          <w:p>
+            <w:r>
+              <w:rPr>
+                <w:sz w:val="18"/>
+              </w:rPr>
+              <w:t>1/3</w:t>
+            </w:r>
+          </w:p>
+        </w:tc>
+        <w:tc>
+          <w:tcPr>
+            <w:tcW w:type="dxa" w:w="2160"/>
+          </w:tcPr>
+          <w:p>
+            <w:r>
+              <w:rPr>
+                <w:sz w:val="18"/>
+              </w:rPr>
+              <w:t>ID2,ID4,ID5 = 3</w:t>
+            </w:r>
+          </w:p>
+        </w:tc>
+        <w:tc>
+          <w:tcPr>
+            <w:tcW w:type="dxa" w:w="1296"/>
+          </w:tcPr>
+          <w:p>
+            <w:r>
+              <w:rPr>
+                <w:sz w:val="18"/>
+              </w:rPr>
               <w:t>3/4</w:t>
-            </w:r>
-          </w:p>
-        </w:tc>
-        <w:tc>
-          <w:tcPr>
-            <w:tcW w:type="dxa" w:w="2160"/>
-          </w:tcPr>
-          <w:p>
-            <w:r>
-              <w:rPr>
-                <w:sz w:val="18"/>
-              </w:rPr>
-              <w:t>2/4</w:t>
-            </w:r>
-          </w:p>
-        </w:tc>
-        <w:tc>
-          <w:tcPr>
-            <w:tcW w:type="dxa" w:w="1872"/>
-          </w:tcPr>
-          <w:p>
-            <w:r>
-              <w:rPr>
-                <w:sz w:val="18"/>
-              </w:rPr>
-              <w:t>3/4</w:t>
-            </w:r>
-          </w:p>
-        </w:tc>
-        <w:tc>
-          <w:tcPr>
-            <w:tcW w:type="dxa" w:w="2304"/>
-          </w:tcPr>
-          <w:p>
-            <w:r>
-              <w:rPr>
-                <w:sz w:val="18"/>
-              </w:rPr>
-              <w:t>4/7*3/4*2/4*3/4 = 0.1607</w:t>
             </w:r>
           </w:p>
         </w:tc>
@@ -12557,20 +13038,6 @@
       <w:pPr>
         <w:spacing w:after="0"/>
       </w:pPr>
-    </w:p>
-    <w:p>
-      <w:pPr>
-        <w:spacing w:after="40"/>
-        <w:ind w:left="320"/>
-      </w:pPr>
-      <w:r>
-        <w:rPr>
-          <w:rFonts w:ascii="Courier New" w:hAnsi="Courier New"/>
-          <w:color w:val="06B6D4"/>
-          <w:sz w:val="20"/>
-        </w:rPr>
-        <w:t>LR score 0.1607 &gt; HR score 0.0635  →  Classified as LOW RISK</w:t>
-      </w:r>
     </w:p>
     <w:p>
       <w:pPr>
@@ -12589,7 +13056,81 @@
           <w:color w:val="92400E"/>
           <w:sz w:val="20"/>
         </w:rPr>
-        <w:t>Exam tip: You do NOT need to normalise the scores — just compare them. The class with the highest product wins.</w:t>
+        <w:t>COMMON ERROR: P(Income=High|LR) = 2/4 NOT 3/4. LR instances with High income: only ID4 and ID6 = 2 out of 4.</w:t>
+      </w:r>
+    </w:p>
+    <w:p>
+      <w:pPr>
+        <w:spacing w:after="40"/>
+      </w:pPr>
+      <w:r>
+        <w:rPr>
+          <w:color w:val="2563EB"/>
+          <w:sz w:val="20"/>
+        </w:rPr>
+        <w:t>Step 3 — Score calculation (Income=High, Credit=Bad, Late=No):</w:t>
+      </w:r>
+    </w:p>
+    <w:p>
+      <w:pPr>
+        <w:spacing w:after="40"/>
+        <w:ind w:left="320"/>
+      </w:pPr>
+      <w:r>
+        <w:rPr>
+          <w:rFonts w:ascii="Courier New" w:hAnsi="Courier New"/>
+          <w:color w:val="06B6D4"/>
+          <w:sz w:val="20"/>
+        </w:rPr>
+        <w:t>Score(HR) = 3/7 × 2/3 × 2/3 × 1/3 = 12/189 = 0.0635</w:t>
+      </w:r>
+    </w:p>
+    <w:p>
+      <w:pPr>
+        <w:spacing w:after="40"/>
+        <w:ind w:left="320"/>
+      </w:pPr>
+      <w:r>
+        <w:rPr>
+          <w:rFonts w:ascii="Courier New" w:hAnsi="Courier New"/>
+          <w:color w:val="06B6D4"/>
+          <w:sz w:val="20"/>
+        </w:rPr>
+        <w:t>Score(LR) = 4/7 × 2/4 × 1/4 × 3/4 = 24/448 = 0.0536</w:t>
+      </w:r>
+    </w:p>
+    <w:p>
+      <w:pPr>
+        <w:spacing w:after="40"/>
+        <w:ind w:left="320"/>
+      </w:pPr>
+      <w:r>
+        <w:rPr>
+          <w:rFonts w:ascii="Courier New" w:hAnsi="Courier New"/>
+          <w:color w:val="06B6D4"/>
+          <w:sz w:val="20"/>
+        </w:rPr>
+        <w:t>Score(HR) = 0.0635 &gt; Score(LR) = 0.0536  →  Classified as HIGH RISK</w:t>
+      </w:r>
+    </w:p>
+    <w:p>
+      <w:pPr>
+        <w:spacing w:after="40"/>
+      </w:pPr>
+      <w:r>
+        <w:rPr>
+          <w:b/>
+          <w:color w:val="F59E0B"/>
+          <w:sz w:val="20"/>
+        </w:rPr>
+        <w:t xml:space="preserve">NOTE: </w:t>
+      </w:r>
+      <w:r>
+        <w:rPr>
+          <w:color w:val="92400E"/>
+          <w:sz w:val="20"/>
+        </w:rPr>
+        <w:t>Exam tip: You do NOT need to normalise the scores — just compare them. The class with the highest product wins. This customer is HIGH RISK despite having High income, because Bad credit history has very low P(Bad|LR)=1/4.</w:t>
       </w:r>
     </w:p>
     <w:p>

</xml_diff>